<commit_message>
Culte preparation Builder change for better culte projection
</commit_message>
<xml_diff>
--- a/Elyon360_Elite_Document_Final.docx
+++ b/Elyon360_Elite_Document_Final.docx
@@ -141,7 +141,76 @@
         <w:pStyle w:val="Heading1"/>
       </w:pPr>
       <w:r>
-        <w:t>3. Infrastructure Multi-Tenant de Haute Précision</w:t>
+        <w:t>3. Workflow Liturgique et Gestion du Culte</w:t>
+      </w:r>
+    </w:p>
+    <w:p>
+      <w:r>
+        <w:t>Elyon 360 révolutionne la gestion du déroulement des services (Service Blocks). L'interface est conçue pour une lecture fluide pendant le culte, privilégiant la clarté référentielle.</w:t>
+      </w:r>
+    </w:p>
+    <w:p>
+      <w:pPr>
+        <w:pStyle w:val="Heading2"/>
+      </w:pPr>
+      <w:r>
+        <w:t>3.1 Lectures Bibliques (Système de Focus)</w:t>
+      </w:r>
+    </w:p>
+    <w:p>
+      <w:r>
+        <w:t>Pour éviter l'encombrement visuel, les lectures sont présentées en deux temps :</w:t>
+      </w:r>
+    </w:p>
+    <w:p>
+      <w:r>
+        <w:t>- Vue Référentielle : Affiche uniquement la référence biblique (ex: 2 Knonik 14) suivie du nom de la personne responsable de la lecture.</w:t>
+      </w:r>
+    </w:p>
+    <w:p>
+      <w:r>
+        <w:t>- Mode Focus : L'utilisateur accède au texte complet de la lecture uniquement en cliquant sur la référence. Cela permet au conducteur de culte de garder une vue d'ensemble sans être submergé par le texte.</w:t>
+      </w:r>
+    </w:p>
+    <w:p>
+      <w:pPr>
+        <w:pStyle w:val="Heading2"/>
+      </w:pPr>
+      <w:r>
+        <w:t>3.2 Gestion des Chants et Hymnologie</w:t>
+      </w:r>
+    </w:p>
+    <w:p>
+      <w:r>
+        <w:t>Le module de chants suit une structure rigoureuse pour les groupes de louange et chorales :</w:t>
+      </w:r>
+    </w:p>
+    <w:p>
+      <w:r>
+        <w:t>- En-tête : Nom de la personne ou du groupe responsable du chant.</w:t>
+      </w:r>
+    </w:p>
+    <w:p>
+      <w:r>
+        <w:t>- Liste des Chants : Affichage épuré comprenant le numéro, la langue/référence, et le titre (ex: 123 FR, CHE, Je louerai l'Éternel).</w:t>
+      </w:r>
+    </w:p>
+    <w:p>
+      <w:r>
+        <w:t>- Séparation : Chaque titre de chant est séparé par un trait horizontal net pour une distinction immédiate.</w:t>
+      </w:r>
+    </w:p>
+    <w:p>
+      <w:r>
+        <w:t>- Interaction : Le clic sur le titre du chant ouvre le 'Focus Chant' contenant les paroles complètes et les notes d'exécution.</w:t>
+      </w:r>
+    </w:p>
+    <w:p>
+      <w:pPr>
+        <w:pStyle w:val="Heading1"/>
+      </w:pPr>
+      <w:r>
+        <w:t>4. Infrastructure Multi-Tenant de Haute Précision</w:t>
       </w:r>
     </w:p>
     <w:p>
@@ -164,7 +233,7 @@
         <w:pStyle w:val="Heading1"/>
       </w:pPr>
       <w:r>
-        <w:t>4. Moteur de Comptabilité et Audit Transparent</w:t>
+        <w:t>5. Moteur de Comptabilité et Audit Transparent</w:t>
       </w:r>
     </w:p>
     <w:p>
@@ -177,7 +246,7 @@
         <w:pStyle w:val="Heading1"/>
       </w:pPr>
       <w:r>
-        <w:t>5. Vision Future et Évolutivité</w:t>
+        <w:t>6. Vision Future et Évolutivité</w:t>
       </w:r>
     </w:p>
     <w:p>

</xml_diff>